<commit_message>
Gasilci 5. ura: dodane postaje in generalka vseh treh vozlov
Co-Authored-By: Claude Opus 5.5 <noreply@anthropic.com>
Claude-Session: https://claude.ai/code/session_01QqpRN3Gvdmvnr4TNHdLVSk
</commit_message>
<xml_diff>
--- a/gradiva/gasilci/2026-11-05 5. ura Jamborski vozel/2 Delovni list.docx
+++ b/gradiva/gasilci/2026-11-05 5. ura Jamborski vozel/2 Delovni list.docx
@@ -1077,7 +1077,7 @@
     </w:p>
     <w:p>
       <w:pPr>
-        <w:spacing w:after="240"/>
+        <w:spacing w:after="200"/>
         <w:jc w:val="center"/>
       </w:pPr>
       <w:r>
@@ -1085,15 +1085,15 @@
           <w:rFonts w:ascii="Arial" w:cs="Arial" w:eastAsia="Arial" w:hAnsi="Arial"/>
           <w:b/>
           <w:bCs/>
-          <w:sz w:val="28"/>
-          <w:szCs w:val="28"/>
+          <w:sz w:val="32"/>
+          <w:szCs w:val="32"/>
         </w:rPr>
-        <w:t xml:space="preserve">Sodniški listki (razreži)</w:t>
+        <w:t xml:space="preserve">GENERALKA: VSI TRIJE VOZLI</w:t>
       </w:r>
     </w:p>
     <w:p>
       <w:pPr>
-        <w:spacing w:after="240"/>
+        <w:spacing w:after="200"/>
       </w:pPr>
       <w:r>
         <w:rPr>
@@ -1101,7 +1101,440 @@
           <w:sz w:val="22"/>
           <w:szCs w:val="22"/>
         </w:rPr>
-        <w:t xml:space="preserve">Igra: Vozel na drogu. Sodnik obkroži ✓, če ima vozel dva ovoja, križ spredaj in ne zdrsne. Šteje pravilnost, ne hitrost.</w:t>
+        <w:t xml:space="preserve">Vaja za štafeto vozlov. Ekipa veže vse tri vozle po vrsti, sodnik iz druge ekipe preveri vsakega. Šteje pravilnost, ne hitrost. Napačen vozel popraviš in poskusiš znova.</w:t>
+      </w:r>
+    </w:p>
+    <w:tbl>
+      <w:tblPr>
+        <w:tblW w:type="dxa" w:w="9638"/>
+        <w:tblBorders>
+          <w:top w:val="single" w:color="auto" w:sz="4"/>
+          <w:left w:val="single" w:color="auto" w:sz="4"/>
+          <w:bottom w:val="single" w:color="auto" w:sz="4"/>
+          <w:right w:val="single" w:color="auto" w:sz="4"/>
+          <w:insideH w:val="single" w:color="auto" w:sz="4"/>
+          <w:insideV w:val="single" w:color="auto" w:sz="4"/>
+        </w:tblBorders>
+      </w:tblPr>
+      <w:tblGrid>
+        <w:gridCol w:w="2200"/>
+        <w:gridCol w:w="2800"/>
+        <w:gridCol w:w="4638"/>
+      </w:tblGrid>
+      <w:tr>
+        <w:tc>
+          <w:tcPr>
+            <w:tcW w:type="dxa" w:w="2200"/>
+            <w:tcBorders>
+              <w:top w:val="single" w:color="999999" w:sz="6"/>
+              <w:left w:val="single" w:color="999999" w:sz="6"/>
+              <w:bottom w:val="single" w:color="999999" w:sz="6"/>
+              <w:right w:val="single" w:color="999999" w:sz="6"/>
+            </w:tcBorders>
+            <w:shd w:fill="EEEEEE" w:color="auto" w:val="clear"/>
+            <w:tcMar>
+              <w:top w:type="dxa" w:w="120"/>
+              <w:left w:type="dxa" w:w="160"/>
+              <w:bottom w:type="dxa" w:w="120"/>
+              <w:right w:type="dxa" w:w="160"/>
+            </w:tcMar>
+          </w:tcPr>
+          <w:p>
+            <w:pPr>
+              <w:spacing w:after="0"/>
+            </w:pPr>
+            <w:r>
+              <w:rPr>
+                <w:rFonts w:ascii="Arial" w:cs="Arial" w:eastAsia="Arial" w:hAnsi="Arial"/>
+                <w:b/>
+                <w:bCs/>
+                <w:sz w:val="26"/>
+                <w:szCs w:val="26"/>
+              </w:rPr>
+              <w:t xml:space="preserve">Vozel</w:t>
+            </w:r>
+          </w:p>
+        </w:tc>
+        <w:tc>
+          <w:tcPr>
+            <w:tcW w:type="dxa" w:w="2800"/>
+            <w:tcBorders>
+              <w:top w:val="single" w:color="999999" w:sz="6"/>
+              <w:left w:val="single" w:color="999999" w:sz="6"/>
+              <w:bottom w:val="single" w:color="999999" w:sz="6"/>
+              <w:right w:val="single" w:color="999999" w:sz="6"/>
+            </w:tcBorders>
+            <w:shd w:fill="EEEEEE" w:color="auto" w:val="clear"/>
+            <w:tcMar>
+              <w:top w:type="dxa" w:w="120"/>
+              <w:left w:type="dxa" w:w="160"/>
+              <w:bottom w:type="dxa" w:w="120"/>
+              <w:right w:type="dxa" w:w="160"/>
+            </w:tcMar>
+          </w:tcPr>
+          <w:p>
+            <w:pPr>
+              <w:spacing w:after="0"/>
+            </w:pPr>
+            <w:r>
+              <w:rPr>
+                <w:rFonts w:ascii="Arial" w:cs="Arial" w:eastAsia="Arial" w:hAnsi="Arial"/>
+                <w:b/>
+                <w:bCs/>
+                <w:sz w:val="26"/>
+                <w:szCs w:val="26"/>
+              </w:rPr>
+              <w:t xml:space="preserve">Kje vežem</w:t>
+            </w:r>
+          </w:p>
+        </w:tc>
+        <w:tc>
+          <w:tcPr>
+            <w:tcW w:type="dxa" w:w="4638"/>
+            <w:tcBorders>
+              <w:top w:val="single" w:color="999999" w:sz="6"/>
+              <w:left w:val="single" w:color="999999" w:sz="6"/>
+              <w:bottom w:val="single" w:color="999999" w:sz="6"/>
+              <w:right w:val="single" w:color="999999" w:sz="6"/>
+            </w:tcBorders>
+            <w:shd w:fill="EEEEEE" w:color="auto" w:val="clear"/>
+            <w:tcMar>
+              <w:top w:type="dxa" w:w="120"/>
+              <w:left w:type="dxa" w:w="160"/>
+              <w:bottom w:type="dxa" w:w="120"/>
+              <w:right w:type="dxa" w:w="160"/>
+            </w:tcMar>
+          </w:tcPr>
+          <w:p>
+            <w:pPr>
+              <w:spacing w:after="0"/>
+            </w:pPr>
+            <w:r>
+              <w:rPr>
+                <w:rFonts w:ascii="Arial" w:cs="Arial" w:eastAsia="Arial" w:hAnsi="Arial"/>
+                <w:b/>
+                <w:bCs/>
+                <w:sz w:val="26"/>
+                <w:szCs w:val="26"/>
+              </w:rPr>
+              <w:t xml:space="preserve">Sodnik preveri</w:t>
+            </w:r>
+          </w:p>
+        </w:tc>
+      </w:tr>
+      <w:tr>
+        <w:tc>
+          <w:tcPr>
+            <w:tcW w:type="dxa" w:w="2200"/>
+            <w:tcBorders>
+              <w:top w:val="single" w:color="999999" w:sz="6"/>
+              <w:left w:val="single" w:color="999999" w:sz="6"/>
+              <w:bottom w:val="single" w:color="999999" w:sz="6"/>
+              <w:right w:val="single" w:color="999999" w:sz="6"/>
+            </w:tcBorders>
+            <w:shd w:fill="FDE2E2" w:color="auto" w:val="clear"/>
+            <w:tcMar>
+              <w:top w:type="dxa" w:w="120"/>
+              <w:left w:type="dxa" w:w="160"/>
+              <w:bottom w:type="dxa" w:w="120"/>
+              <w:right w:type="dxa" w:w="160"/>
+            </w:tcMar>
+          </w:tcPr>
+          <w:p>
+            <w:pPr>
+              <w:spacing w:after="0"/>
+            </w:pPr>
+            <w:r>
+              <w:rPr>
+                <w:rFonts w:ascii="Arial" w:cs="Arial" w:eastAsia="Arial" w:hAnsi="Arial"/>
+                <w:b/>
+                <w:bCs/>
+                <w:sz w:val="26"/>
+                <w:szCs w:val="26"/>
+              </w:rPr>
+              <w:t xml:space="preserve">Tesarski</w:t>
+            </w:r>
+          </w:p>
+        </w:tc>
+        <w:tc>
+          <w:tcPr>
+            <w:tcW w:type="dxa" w:w="2800"/>
+            <w:tcBorders>
+              <w:top w:val="single" w:color="999999" w:sz="6"/>
+              <w:left w:val="single" w:color="999999" w:sz="6"/>
+              <w:bottom w:val="single" w:color="999999" w:sz="6"/>
+              <w:right w:val="single" w:color="999999" w:sz="6"/>
+            </w:tcBorders>
+            <w:tcMar>
+              <w:top w:type="dxa" w:w="120"/>
+              <w:left w:type="dxa" w:w="160"/>
+              <w:bottom w:type="dxa" w:w="120"/>
+              <w:right w:type="dxa" w:w="160"/>
+            </w:tcMar>
+          </w:tcPr>
+          <w:p>
+            <w:pPr>
+              <w:spacing w:after="0"/>
+            </w:pPr>
+            <w:r>
+              <w:rPr>
+                <w:rFonts w:ascii="Arial" w:cs="Arial" w:eastAsia="Arial" w:hAnsi="Arial"/>
+                <w:sz w:val="26"/>
+                <w:szCs w:val="26"/>
+              </w:rPr>
+              <w:t xml:space="preserve">na naslonjalu stola</w:t>
+            </w:r>
+          </w:p>
+        </w:tc>
+        <w:tc>
+          <w:tcPr>
+            <w:tcW w:type="dxa" w:w="4638"/>
+            <w:tcBorders>
+              <w:top w:val="single" w:color="999999" w:sz="6"/>
+              <w:left w:val="single" w:color="999999" w:sz="6"/>
+              <w:bottom w:val="single" w:color="999999" w:sz="6"/>
+              <w:right w:val="single" w:color="999999" w:sz="6"/>
+            </w:tcBorders>
+            <w:tcMar>
+              <w:top w:type="dxa" w:w="120"/>
+              <w:left w:type="dxa" w:w="160"/>
+              <w:bottom w:type="dxa" w:w="120"/>
+              <w:right w:type="dxa" w:w="160"/>
+            </w:tcMar>
+          </w:tcPr>
+          <w:p>
+            <w:pPr>
+              <w:spacing w:after="0"/>
+            </w:pPr>
+            <w:r>
+              <w:rPr>
+                <w:rFonts w:ascii="Arial" w:cs="Arial" w:eastAsia="Arial" w:hAnsi="Arial"/>
+                <w:sz w:val="26"/>
+                <w:szCs w:val="26"/>
+              </w:rPr>
+              <w:t xml:space="preserve">trije ovoji, ob potegu drži</w:t>
+            </w:r>
+          </w:p>
+        </w:tc>
+      </w:tr>
+      <w:tr>
+        <w:tc>
+          <w:tcPr>
+            <w:tcW w:type="dxa" w:w="2200"/>
+            <w:tcBorders>
+              <w:top w:val="single" w:color="999999" w:sz="6"/>
+              <w:left w:val="single" w:color="999999" w:sz="6"/>
+              <w:bottom w:val="single" w:color="999999" w:sz="6"/>
+              <w:right w:val="single" w:color="999999" w:sz="6"/>
+            </w:tcBorders>
+            <w:shd w:fill="FDE2E2" w:color="auto" w:val="clear"/>
+            <w:tcMar>
+              <w:top w:type="dxa" w:w="120"/>
+              <w:left w:type="dxa" w:w="160"/>
+              <w:bottom w:type="dxa" w:w="120"/>
+              <w:right w:type="dxa" w:w="160"/>
+            </w:tcMar>
+          </w:tcPr>
+          <w:p>
+            <w:pPr>
+              <w:spacing w:after="0"/>
+            </w:pPr>
+            <w:r>
+              <w:rPr>
+                <w:rFonts w:ascii="Arial" w:cs="Arial" w:eastAsia="Arial" w:hAnsi="Arial"/>
+                <w:b/>
+                <w:bCs/>
+                <w:sz w:val="26"/>
+                <w:szCs w:val="26"/>
+              </w:rPr>
+              <w:t xml:space="preserve">Tkalski</w:t>
+            </w:r>
+          </w:p>
+        </w:tc>
+        <w:tc>
+          <w:tcPr>
+            <w:tcW w:type="dxa" w:w="2800"/>
+            <w:tcBorders>
+              <w:top w:val="single" w:color="999999" w:sz="6"/>
+              <w:left w:val="single" w:color="999999" w:sz="6"/>
+              <w:bottom w:val="single" w:color="999999" w:sz="6"/>
+              <w:right w:val="single" w:color="999999" w:sz="6"/>
+            </w:tcBorders>
+            <w:tcMar>
+              <w:top w:type="dxa" w:w="120"/>
+              <w:left w:type="dxa" w:w="160"/>
+              <w:bottom w:type="dxa" w:w="120"/>
+              <w:right w:type="dxa" w:w="160"/>
+            </w:tcMar>
+          </w:tcPr>
+          <w:p>
+            <w:pPr>
+              <w:spacing w:after="0"/>
+            </w:pPr>
+            <w:r>
+              <w:rPr>
+                <w:rFonts w:ascii="Arial" w:cs="Arial" w:eastAsia="Arial" w:hAnsi="Arial"/>
+                <w:sz w:val="26"/>
+                <w:szCs w:val="26"/>
+              </w:rPr>
+              <w:t xml:space="preserve">dve vrvi na mizi</w:t>
+            </w:r>
+          </w:p>
+        </w:tc>
+        <w:tc>
+          <w:tcPr>
+            <w:tcW w:type="dxa" w:w="4638"/>
+            <w:tcBorders>
+              <w:top w:val="single" w:color="999999" w:sz="6"/>
+              <w:left w:val="single" w:color="999999" w:sz="6"/>
+              <w:bottom w:val="single" w:color="999999" w:sz="6"/>
+              <w:right w:val="single" w:color="999999" w:sz="6"/>
+            </w:tcBorders>
+            <w:tcMar>
+              <w:top w:type="dxa" w:w="120"/>
+              <w:left w:type="dxa" w:w="160"/>
+              <w:bottom w:type="dxa" w:w="120"/>
+              <w:right w:type="dxa" w:w="160"/>
+            </w:tcMar>
+          </w:tcPr>
+          <w:p>
+            <w:pPr>
+              <w:spacing w:after="0"/>
+            </w:pPr>
+            <w:r>
+              <w:rPr>
+                <w:rFonts w:ascii="Arial" w:cs="Arial" w:eastAsia="Arial" w:hAnsi="Arial"/>
+                <w:sz w:val="26"/>
+                <w:szCs w:val="26"/>
+              </w:rPr>
+              <w:t xml:space="preserve">prosta konca na isti strani</w:t>
+            </w:r>
+          </w:p>
+        </w:tc>
+      </w:tr>
+      <w:tr>
+        <w:tc>
+          <w:tcPr>
+            <w:tcW w:type="dxa" w:w="2200"/>
+            <w:tcBorders>
+              <w:top w:val="single" w:color="999999" w:sz="6"/>
+              <w:left w:val="single" w:color="999999" w:sz="6"/>
+              <w:bottom w:val="single" w:color="999999" w:sz="6"/>
+              <w:right w:val="single" w:color="999999" w:sz="6"/>
+            </w:tcBorders>
+            <w:shd w:fill="FDE2E2" w:color="auto" w:val="clear"/>
+            <w:tcMar>
+              <w:top w:type="dxa" w:w="120"/>
+              <w:left w:type="dxa" w:w="160"/>
+              <w:bottom w:type="dxa" w:w="120"/>
+              <w:right w:type="dxa" w:w="160"/>
+            </w:tcMar>
+          </w:tcPr>
+          <w:p>
+            <w:pPr>
+              <w:spacing w:after="0"/>
+            </w:pPr>
+            <w:r>
+              <w:rPr>
+                <w:rFonts w:ascii="Arial" w:cs="Arial" w:eastAsia="Arial" w:hAnsi="Arial"/>
+                <w:b/>
+                <w:bCs/>
+                <w:sz w:val="26"/>
+                <w:szCs w:val="26"/>
+              </w:rPr>
+              <w:t xml:space="preserve">Jamborski</w:t>
+            </w:r>
+          </w:p>
+        </w:tc>
+        <w:tc>
+          <w:tcPr>
+            <w:tcW w:type="dxa" w:w="2800"/>
+            <w:tcBorders>
+              <w:top w:val="single" w:color="999999" w:sz="6"/>
+              <w:left w:val="single" w:color="999999" w:sz="6"/>
+              <w:bottom w:val="single" w:color="999999" w:sz="6"/>
+              <w:right w:val="single" w:color="999999" w:sz="6"/>
+            </w:tcBorders>
+            <w:tcMar>
+              <w:top w:type="dxa" w:w="120"/>
+              <w:left w:type="dxa" w:w="160"/>
+              <w:bottom w:type="dxa" w:w="120"/>
+              <w:right w:type="dxa" w:w="160"/>
+            </w:tcMar>
+          </w:tcPr>
+          <w:p>
+            <w:pPr>
+              <w:spacing w:after="0"/>
+            </w:pPr>
+            <w:r>
+              <w:rPr>
+                <w:rFonts w:ascii="Arial" w:cs="Arial" w:eastAsia="Arial" w:hAnsi="Arial"/>
+                <w:sz w:val="26"/>
+                <w:szCs w:val="26"/>
+              </w:rPr>
+              <w:t xml:space="preserve">na drogu</w:t>
+            </w:r>
+          </w:p>
+        </w:tc>
+        <w:tc>
+          <w:tcPr>
+            <w:tcW w:type="dxa" w:w="4638"/>
+            <w:tcBorders>
+              <w:top w:val="single" w:color="999999" w:sz="6"/>
+              <w:left w:val="single" w:color="999999" w:sz="6"/>
+              <w:bottom w:val="single" w:color="999999" w:sz="6"/>
+              <w:right w:val="single" w:color="999999" w:sz="6"/>
+            </w:tcBorders>
+            <w:tcMar>
+              <w:top w:type="dxa" w:w="120"/>
+              <w:left w:type="dxa" w:w="160"/>
+              <w:bottom w:type="dxa" w:w="120"/>
+              <w:right w:type="dxa" w:w="160"/>
+            </w:tcMar>
+          </w:tcPr>
+          <w:p>
+            <w:pPr>
+              <w:spacing w:after="0"/>
+            </w:pPr>
+            <w:r>
+              <w:rPr>
+                <w:rFonts w:ascii="Arial" w:cs="Arial" w:eastAsia="Arial" w:hAnsi="Arial"/>
+                <w:sz w:val="26"/>
+                <w:szCs w:val="26"/>
+              </w:rPr>
+              <w:t xml:space="preserve">dva ovoja in križ spredaj, ne zdrsne</w:t>
+            </w:r>
+          </w:p>
+        </w:tc>
+      </w:tr>
+    </w:tbl>
+    <w:p>
+      <w:pPr>
+        <w:spacing w:after="200"/>
+      </w:pPr>
+      <w:r>
+        <w:rPr>
+          <w:rFonts w:ascii="Arial" w:cs="Arial" w:eastAsia="Arial" w:hAnsi="Arial"/>
+          <w:sz w:val="26"/>
+          <w:szCs w:val="26"/>
+        </w:rPr>
+        <w:t xml:space="preserve"/>
+      </w:r>
+    </w:p>
+    <w:p>
+      <w:pPr>
+        <w:spacing w:after="160"/>
+        <w:jc w:val="center"/>
+      </w:pPr>
+      <w:r>
+        <w:rPr>
+          <w:rFonts w:ascii="Arial" w:cs="Arial" w:eastAsia="Arial" w:hAnsi="Arial"/>
+          <w:b/>
+          <w:bCs/>
+          <w:sz w:val="24"/>
+          <w:szCs w:val="24"/>
+        </w:rPr>
+        <w:t xml:space="preserve">Sodniški listki (razreži)</w:t>
       </w:r>
     </w:p>
     <w:tbl>
@@ -1149,7 +1582,7 @@
                 <w:sz w:val="22"/>
                 <w:szCs w:val="22"/>
               </w:rPr>
-              <w:t xml:space="preserve">SODNIŠKI LISTEK: Vozel na drogu</w:t>
+              <w:t xml:space="preserve">SODNIŠKI LISTEK: Generalka</w:t>
             </w:r>
           </w:p>
           <w:p>
@@ -1175,7 +1608,7 @@
                 <w:sz w:val="24"/>
                 <w:szCs w:val="24"/>
               </w:rPr>
-              <w:t xml:space="preserve">1. poskus:   ✓   ✗</w:t>
+              <w:t xml:space="preserve">Tesarski:   ✓   ✗</w:t>
             </w:r>
           </w:p>
           <w:p>
@@ -1188,7 +1621,7 @@
                 <w:sz w:val="24"/>
                 <w:szCs w:val="24"/>
               </w:rPr>
-              <w:t xml:space="preserve">2. poskus:   ✓   ✗</w:t>
+              <w:t xml:space="preserve">Tkalski:     ✓   ✗</w:t>
             </w:r>
           </w:p>
           <w:p>
@@ -1201,7 +1634,7 @@
                 <w:sz w:val="24"/>
                 <w:szCs w:val="24"/>
               </w:rPr>
-              <w:t xml:space="preserve">3. poskus:   ✓   ✗</w:t>
+              <w:t xml:space="preserve">Jamborski:  ✓   ✗</w:t>
             </w:r>
           </w:p>
           <w:p>
@@ -1246,7 +1679,7 @@
                 <w:sz w:val="22"/>
                 <w:szCs w:val="22"/>
               </w:rPr>
-              <w:t xml:space="preserve">SODNIŠKI LISTEK: Vozel na drogu</w:t>
+              <w:t xml:space="preserve">SODNIŠKI LISTEK: Generalka</w:t>
             </w:r>
           </w:p>
           <w:p>
@@ -1272,7 +1705,7 @@
                 <w:sz w:val="24"/>
                 <w:szCs w:val="24"/>
               </w:rPr>
-              <w:t xml:space="preserve">1. poskus:   ✓   ✗</w:t>
+              <w:t xml:space="preserve">Tesarski:   ✓   ✗</w:t>
             </w:r>
           </w:p>
           <w:p>
@@ -1285,7 +1718,7 @@
                 <w:sz w:val="24"/>
                 <w:szCs w:val="24"/>
               </w:rPr>
-              <w:t xml:space="preserve">2. poskus:   ✓   ✗</w:t>
+              <w:t xml:space="preserve">Tkalski:     ✓   ✗</w:t>
             </w:r>
           </w:p>
           <w:p>
@@ -1298,7 +1731,7 @@
                 <w:sz w:val="24"/>
                 <w:szCs w:val="24"/>
               </w:rPr>
-              <w:t xml:space="preserve">3. poskus:   ✓   ✗</w:t>
+              <w:t xml:space="preserve">Jamborski:  ✓   ✗</w:t>
             </w:r>
           </w:p>
           <w:p>
@@ -1345,7 +1778,7 @@
                 <w:sz w:val="22"/>
                 <w:szCs w:val="22"/>
               </w:rPr>
-              <w:t xml:space="preserve">SODNIŠKI LISTEK: Vozel na drogu</w:t>
+              <w:t xml:space="preserve">SODNIŠKI LISTEK: Generalka</w:t>
             </w:r>
           </w:p>
           <w:p>
@@ -1371,7 +1804,7 @@
                 <w:sz w:val="24"/>
                 <w:szCs w:val="24"/>
               </w:rPr>
-              <w:t xml:space="preserve">1. poskus:   ✓   ✗</w:t>
+              <w:t xml:space="preserve">Tesarski:   ✓   ✗</w:t>
             </w:r>
           </w:p>
           <w:p>
@@ -1384,7 +1817,7 @@
                 <w:sz w:val="24"/>
                 <w:szCs w:val="24"/>
               </w:rPr>
-              <w:t xml:space="preserve">2. poskus:   ✓   ✗</w:t>
+              <w:t xml:space="preserve">Tkalski:     ✓   ✗</w:t>
             </w:r>
           </w:p>
           <w:p>
@@ -1397,7 +1830,7 @@
                 <w:sz w:val="24"/>
                 <w:szCs w:val="24"/>
               </w:rPr>
-              <w:t xml:space="preserve">3. poskus:   ✓   ✗</w:t>
+              <w:t xml:space="preserve">Jamborski:  ✓   ✗</w:t>
             </w:r>
           </w:p>
           <w:p>
@@ -1442,7 +1875,7 @@
                 <w:sz w:val="22"/>
                 <w:szCs w:val="22"/>
               </w:rPr>
-              <w:t xml:space="preserve">SODNIŠKI LISTEK: Vozel na drogu</w:t>
+              <w:t xml:space="preserve">SODNIŠKI LISTEK: Generalka</w:t>
             </w:r>
           </w:p>
           <w:p>
@@ -1468,7 +1901,7 @@
                 <w:sz w:val="24"/>
                 <w:szCs w:val="24"/>
               </w:rPr>
-              <w:t xml:space="preserve">1. poskus:   ✓   ✗</w:t>
+              <w:t xml:space="preserve">Tesarski:   ✓   ✗</w:t>
             </w:r>
           </w:p>
           <w:p>
@@ -1481,7 +1914,7 @@
                 <w:sz w:val="24"/>
                 <w:szCs w:val="24"/>
               </w:rPr>
-              <w:t xml:space="preserve">2. poskus:   ✓   ✗</w:t>
+              <w:t xml:space="preserve">Tkalski:     ✓   ✗</w:t>
             </w:r>
           </w:p>
           <w:p>
@@ -1494,203 +1927,7 @@
                 <w:sz w:val="24"/>
                 <w:szCs w:val="24"/>
               </w:rPr>
-              <w:t xml:space="preserve">3. poskus:   ✓   ✗</w:t>
-            </w:r>
-          </w:p>
-          <w:p>
-            <w:pPr>
-              <w:spacing w:after="0"/>
-            </w:pPr>
-            <w:r>
-              <w:rPr>
-                <w:rFonts w:ascii="Arial" w:cs="Arial" w:eastAsia="Arial" w:hAnsi="Arial"/>
-                <w:sz w:val="22"/>
-                <w:szCs w:val="22"/>
-              </w:rPr>
-              <w:t xml:space="preserve">Sodnik: _____________________</w:t>
-            </w:r>
-          </w:p>
-        </w:tc>
-      </w:tr>
-      <w:tr>
-        <w:tc>
-          <w:tcPr>
-            <w:tcW w:type="dxa" w:w="4819"/>
-            <w:tcBorders>
-              <w:top w:val="single" w:color="999999" w:sz="6"/>
-              <w:left w:val="single" w:color="999999" w:sz="6"/>
-              <w:bottom w:val="single" w:color="999999" w:sz="6"/>
-              <w:right w:val="single" w:color="999999" w:sz="6"/>
-            </w:tcBorders>
-            <w:tcMar>
-              <w:top w:type="dxa" w:w="120"/>
-              <w:left w:type="dxa" w:w="160"/>
-              <w:bottom w:type="dxa" w:w="120"/>
-              <w:right w:type="dxa" w:w="160"/>
-            </w:tcMar>
-          </w:tcPr>
-          <w:p>
-            <w:pPr>
-              <w:spacing w:after="120"/>
-            </w:pPr>
-            <w:r>
-              <w:rPr>
-                <w:rFonts w:ascii="Arial" w:cs="Arial" w:eastAsia="Arial" w:hAnsi="Arial"/>
-                <w:b/>
-                <w:bCs/>
-                <w:sz w:val="22"/>
-                <w:szCs w:val="22"/>
-              </w:rPr>
-              <w:t xml:space="preserve">SODNIŠKI LISTEK: Vozel na drogu</w:t>
-            </w:r>
-          </w:p>
-          <w:p>
-            <w:pPr>
-              <w:spacing w:after="120"/>
-            </w:pPr>
-            <w:r>
-              <w:rPr>
-                <w:rFonts w:ascii="Arial" w:cs="Arial" w:eastAsia="Arial" w:hAnsi="Arial"/>
-                <w:sz w:val="22"/>
-                <w:szCs w:val="22"/>
-              </w:rPr>
-              <w:t xml:space="preserve">Ekipa: ______________________</w:t>
-            </w:r>
-          </w:p>
-          <w:p>
-            <w:pPr>
-              <w:spacing w:after="120"/>
-            </w:pPr>
-            <w:r>
-              <w:rPr>
-                <w:rFonts w:ascii="Arial" w:cs="Arial" w:eastAsia="Arial" w:hAnsi="Arial"/>
-                <w:sz w:val="24"/>
-                <w:szCs w:val="24"/>
-              </w:rPr>
-              <w:t xml:space="preserve">1. poskus:   ✓   ✗</w:t>
-            </w:r>
-          </w:p>
-          <w:p>
-            <w:pPr>
-              <w:spacing w:after="120"/>
-            </w:pPr>
-            <w:r>
-              <w:rPr>
-                <w:rFonts w:ascii="Arial" w:cs="Arial" w:eastAsia="Arial" w:hAnsi="Arial"/>
-                <w:sz w:val="24"/>
-                <w:szCs w:val="24"/>
-              </w:rPr>
-              <w:t xml:space="preserve">2. poskus:   ✓   ✗</w:t>
-            </w:r>
-          </w:p>
-          <w:p>
-            <w:pPr>
-              <w:spacing w:after="120"/>
-            </w:pPr>
-            <w:r>
-              <w:rPr>
-                <w:rFonts w:ascii="Arial" w:cs="Arial" w:eastAsia="Arial" w:hAnsi="Arial"/>
-                <w:sz w:val="24"/>
-                <w:szCs w:val="24"/>
-              </w:rPr>
-              <w:t xml:space="preserve">3. poskus:   ✓   ✗</w:t>
-            </w:r>
-          </w:p>
-          <w:p>
-            <w:pPr>
-              <w:spacing w:after="0"/>
-            </w:pPr>
-            <w:r>
-              <w:rPr>
-                <w:rFonts w:ascii="Arial" w:cs="Arial" w:eastAsia="Arial" w:hAnsi="Arial"/>
-                <w:sz w:val="22"/>
-                <w:szCs w:val="22"/>
-              </w:rPr>
-              <w:t xml:space="preserve">Sodnik: _____________________</w:t>
-            </w:r>
-          </w:p>
-        </w:tc>
-        <w:tc>
-          <w:tcPr>
-            <w:tcW w:type="dxa" w:w="4819"/>
-            <w:tcBorders>
-              <w:top w:val="single" w:color="999999" w:sz="6"/>
-              <w:left w:val="single" w:color="999999" w:sz="6"/>
-              <w:bottom w:val="single" w:color="999999" w:sz="6"/>
-              <w:right w:val="single" w:color="999999" w:sz="6"/>
-            </w:tcBorders>
-            <w:tcMar>
-              <w:top w:type="dxa" w:w="120"/>
-              <w:left w:type="dxa" w:w="160"/>
-              <w:bottom w:type="dxa" w:w="120"/>
-              <w:right w:type="dxa" w:w="160"/>
-            </w:tcMar>
-          </w:tcPr>
-          <w:p>
-            <w:pPr>
-              <w:spacing w:after="120"/>
-            </w:pPr>
-            <w:r>
-              <w:rPr>
-                <w:rFonts w:ascii="Arial" w:cs="Arial" w:eastAsia="Arial" w:hAnsi="Arial"/>
-                <w:b/>
-                <w:bCs/>
-                <w:sz w:val="22"/>
-                <w:szCs w:val="22"/>
-              </w:rPr>
-              <w:t xml:space="preserve">SODNIŠKI LISTEK: Vozel na drogu</w:t>
-            </w:r>
-          </w:p>
-          <w:p>
-            <w:pPr>
-              <w:spacing w:after="120"/>
-            </w:pPr>
-            <w:r>
-              <w:rPr>
-                <w:rFonts w:ascii="Arial" w:cs="Arial" w:eastAsia="Arial" w:hAnsi="Arial"/>
-                <w:sz w:val="22"/>
-                <w:szCs w:val="22"/>
-              </w:rPr>
-              <w:t xml:space="preserve">Ekipa: ______________________</w:t>
-            </w:r>
-          </w:p>
-          <w:p>
-            <w:pPr>
-              <w:spacing w:after="120"/>
-            </w:pPr>
-            <w:r>
-              <w:rPr>
-                <w:rFonts w:ascii="Arial" w:cs="Arial" w:eastAsia="Arial" w:hAnsi="Arial"/>
-                <w:sz w:val="24"/>
-                <w:szCs w:val="24"/>
-              </w:rPr>
-              <w:t xml:space="preserve">1. poskus:   ✓   ✗</w:t>
-            </w:r>
-          </w:p>
-          <w:p>
-            <w:pPr>
-              <w:spacing w:after="120"/>
-            </w:pPr>
-            <w:r>
-              <w:rPr>
-                <w:rFonts w:ascii="Arial" w:cs="Arial" w:eastAsia="Arial" w:hAnsi="Arial"/>
-                <w:sz w:val="24"/>
-                <w:szCs w:val="24"/>
-              </w:rPr>
-              <w:t xml:space="preserve">2. poskus:   ✓   ✗</w:t>
-            </w:r>
-          </w:p>
-          <w:p>
-            <w:pPr>
-              <w:spacing w:after="120"/>
-            </w:pPr>
-            <w:r>
-              <w:rPr>
-                <w:rFonts w:ascii="Arial" w:cs="Arial" w:eastAsia="Arial" w:hAnsi="Arial"/>
-                <w:sz w:val="24"/>
-                <w:szCs w:val="24"/>
-              </w:rPr>
-              <w:t xml:space="preserve">3. poskus:   ✓   ✗</w:t>
+              <w:t xml:space="preserve">Jamborski:  ✓   ✗</w:t>
             </w:r>
           </w:p>
           <w:p>

</xml_diff>